<commit_message>
Update article title and content for "Checking Normals with Face Orientation" tutorial
</commit_message>
<xml_diff>
--- a/Articles/2026/4_Blender_Tips_and_Tricks/5_Checking_Normals_with_Face_Orientation/Write Up.docx
+++ b/Articles/2026/4_Blender_Tips_and_Tricks/5_Checking_Normals_with_Face_Orientation/Write Up.docx
@@ -12,19 +12,7 @@
     </w:p>
     <w:p>
       <w:r>
-        <w:t>This week, we're going to take a look at how to check the face normals on your model using Blender's Face Orientation display.</w:t>
-      </w:r>
-      <w:r>
-        <w:t xml:space="preserve"> </w:t>
-      </w:r>
-      <w:r>
-        <w:t>You may not realize it, but every face on your model has an inside and an outside. If those faces ever end up pointing the wrong way, Blender can become very confused. You may not be sending your character to the emergency room, but you could find yourself with strange shading, missing faces, and a few modeling headaches along the way.</w:t>
-      </w:r>
-      <w:r>
-        <w:t xml:space="preserve"> </w:t>
-      </w:r>
-      <w:r>
-        <w:t>Fortunately, Blender has a quick and easy way to spot these problems before they turn into something much bigger.</w:t>
+        <w:t>This week, we're going to take a look at how to check the face normals on your model using Blender's Face Orientation display. You may not realize it, but every face on your model has an inside and an outside. If those faces ever end up pointing the wrong way, Blender can become very confused. You may not be sending your character to the emergency room, but you could find yourself with strange shading, missing faces, and a few modeling headaches along the way. Fortunately, Blender has a quick and easy way to spot these problems before they turn into something much bigger.</w:t>
       </w:r>
     </w:p>
     <w:p/>
@@ -46,6 +34,9 @@
       <w:pPr>
         <w:pStyle w:val="Heading1"/>
       </w:pPr>
+      <w:r>
+        <w:t xml:space="preserve">5 </w:t>
+      </w:r>
       <w:r>
         <w:t>Checking Normals with Face Orientation</w:t>
       </w:r>

</xml_diff>